<commit_message>
Settlements "Add" button  Form label/input spacing  Arabic translation for "Expense"
</commit_message>
<xml_diff>
--- a/Troubleshooting.docx
+++ b/Troubleshooting.docx
@@ -24,6 +24,262 @@
       <w:proofErr w:type="spellEnd"/>
       <w:r>
         <w:t xml:space="preserve"> toggle </w:t>
+      </w:r>
+    </w:p>
+    <w:p/>
+    <w:p>
+      <w:r>
+        <w:rPr>
+          <w:b/>
+          <w:bCs/>
+        </w:rPr>
+        <w:t xml:space="preserve">In the </w:t>
+      </w:r>
+      <w:r>
+        <w:rPr>
+          <w:b/>
+          <w:bCs/>
+        </w:rPr>
+        <w:t>Settlements</w:t>
+      </w:r>
+      <w:r>
+        <w:t xml:space="preserve"> page when I click the add </w:t>
+      </w:r>
+      <w:r>
+        <w:rPr>
+          <w:b/>
+          <w:bCs/>
+        </w:rPr>
+        <w:t>Settlements</w:t>
+      </w:r>
+      <w:r>
+        <w:t xml:space="preserve"> nothing happens,</w:t>
+      </w:r>
+    </w:p>
+    <w:p>
+      <w:r>
+        <w:t xml:space="preserve">In each page the add new button when I click it </w:t>
+      </w:r>
+      <w:proofErr w:type="spellStart"/>
+      <w:r>
+        <w:t>it</w:t>
+      </w:r>
+      <w:proofErr w:type="spellEnd"/>
+      <w:r>
+        <w:t xml:space="preserve"> opens this window so I can add my data but as you can see from the screen attached the padding between the name of the box and the data box is too close, also if the popup page can be opened as a full page it would be better</w:t>
+      </w:r>
+    </w:p>
+    <w:p>
+      <w:r>
+        <w:rPr>
+          <w:noProof/>
+        </w:rPr>
+        <w:drawing>
+          <wp:inline distT="0" distB="0" distL="0" distR="0" wp14:anchorId="14AAEC84" wp14:editId="5F7C1AF4">
+            <wp:extent cx="5932170" cy="2766695"/>
+            <wp:effectExtent l="0" t="0" r="0" b="0"/>
+            <wp:docPr id="993090787" name="Picture 1"/>
+            <wp:cNvGraphicFramePr>
+              <a:graphicFrameLocks xmlns:a="http://schemas.openxmlformats.org/drawingml/2006/main" noChangeAspect="1"/>
+            </wp:cNvGraphicFramePr>
+            <a:graphic xmlns:a="http://schemas.openxmlformats.org/drawingml/2006/main">
+              <a:graphicData uri="http://schemas.openxmlformats.org/drawingml/2006/picture">
+                <pic:pic xmlns:pic="http://schemas.openxmlformats.org/drawingml/2006/picture">
+                  <pic:nvPicPr>
+                    <pic:cNvPr id="0" name="Picture 1"/>
+                    <pic:cNvPicPr>
+                      <a:picLocks noChangeAspect="1" noChangeArrowheads="1"/>
+                    </pic:cNvPicPr>
+                  </pic:nvPicPr>
+                  <pic:blipFill>
+                    <a:blip r:embed="rId4" cstate="print">
+                      <a:extLst>
+                        <a:ext uri="{28A0092B-C50C-407E-A947-70E740481C1C}">
+                          <a14:useLocalDpi xmlns:a14="http://schemas.microsoft.com/office/drawing/2010/main" val="0"/>
+                        </a:ext>
+                      </a:extLst>
+                    </a:blip>
+                    <a:srcRect/>
+                    <a:stretch>
+                      <a:fillRect/>
+                    </a:stretch>
+                  </pic:blipFill>
+                  <pic:spPr bwMode="auto">
+                    <a:xfrm>
+                      <a:off x="0" y="0"/>
+                      <a:ext cx="5932170" cy="2766695"/>
+                    </a:xfrm>
+                    <a:prstGeom prst="rect">
+                      <a:avLst/>
+                    </a:prstGeom>
+                    <a:noFill/>
+                    <a:ln>
+                      <a:noFill/>
+                    </a:ln>
+                  </pic:spPr>
+                </pic:pic>
+              </a:graphicData>
+            </a:graphic>
+          </wp:inline>
+        </w:drawing>
+      </w:r>
+    </w:p>
+    <w:p>
+      <w:r>
+        <w:t>The 2</w:t>
+      </w:r>
+      <w:r>
+        <w:rPr>
+          <w:vertAlign w:val="superscript"/>
+        </w:rPr>
+        <w:t>nd</w:t>
+      </w:r>
+      <w:r>
+        <w:t xml:space="preserve"> screen in the setting page the manage list looks corrupted</w:t>
+      </w:r>
+    </w:p>
+    <w:p>
+      <w:r>
+        <w:rPr>
+          <w:noProof/>
+        </w:rPr>
+        <w:lastRenderedPageBreak/>
+        <w:drawing>
+          <wp:inline distT="0" distB="0" distL="0" distR="0" wp14:anchorId="14E1E814" wp14:editId="727BB350">
+            <wp:extent cx="5943600" cy="3053715"/>
+            <wp:effectExtent l="0" t="0" r="0" b="0"/>
+            <wp:docPr id="384921277" name="Picture 2"/>
+            <wp:cNvGraphicFramePr>
+              <a:graphicFrameLocks xmlns:a="http://schemas.openxmlformats.org/drawingml/2006/main" noChangeAspect="1"/>
+            </wp:cNvGraphicFramePr>
+            <a:graphic xmlns:a="http://schemas.openxmlformats.org/drawingml/2006/main">
+              <a:graphicData uri="http://schemas.openxmlformats.org/drawingml/2006/picture">
+                <pic:pic xmlns:pic="http://schemas.openxmlformats.org/drawingml/2006/picture">
+                  <pic:nvPicPr>
+                    <pic:cNvPr id="0" name="Picture 2"/>
+                    <pic:cNvPicPr>
+                      <a:picLocks noChangeAspect="1" noChangeArrowheads="1"/>
+                    </pic:cNvPicPr>
+                  </pic:nvPicPr>
+                  <pic:blipFill>
+                    <a:blip r:embed="rId5" cstate="print">
+                      <a:extLst>
+                        <a:ext uri="{28A0092B-C50C-407E-A947-70E740481C1C}">
+                          <a14:useLocalDpi xmlns:a14="http://schemas.microsoft.com/office/drawing/2010/main" val="0"/>
+                        </a:ext>
+                      </a:extLst>
+                    </a:blip>
+                    <a:srcRect/>
+                    <a:stretch>
+                      <a:fillRect/>
+                    </a:stretch>
+                  </pic:blipFill>
+                  <pic:spPr bwMode="auto">
+                    <a:xfrm>
+                      <a:off x="0" y="0"/>
+                      <a:ext cx="5943600" cy="3053715"/>
+                    </a:xfrm>
+                    <a:prstGeom prst="rect">
+                      <a:avLst/>
+                    </a:prstGeom>
+                    <a:noFill/>
+                    <a:ln>
+                      <a:noFill/>
+                    </a:ln>
+                  </pic:spPr>
+                </pic:pic>
+              </a:graphicData>
+            </a:graphic>
+          </wp:inline>
+        </w:drawing>
+      </w:r>
+    </w:p>
+    <w:p/>
+    <w:p>
+      <w:r>
+        <w:t>Fix the following:</w:t>
+      </w:r>
+    </w:p>
+    <w:p>
+      <w:r>
+        <w:t>In the settlements page when I click the add button nothing happens</w:t>
+      </w:r>
+    </w:p>
+    <w:p>
+      <w:r>
+        <w:t>In the expense page, in the add popup window the names of each box are too close to the box need to adjust the padding also fix it in all pages, the Arabic translation of expense to be changed to (</w:t>
+      </w:r>
+      <w:r>
+        <w:rPr>
+          <w:rFonts w:hint="cs"/>
+          <w:rtl/>
+          <w:lang w:bidi="ar-EG"/>
+        </w:rPr>
+        <w:t>العهده</w:t>
+      </w:r>
+      <w:r>
+        <w:t>)</w:t>
+      </w:r>
+    </w:p>
+    <w:p>
+      <w:r>
+        <w:rPr>
+          <w:noProof/>
+        </w:rPr>
+        <w:drawing>
+          <wp:inline distT="0" distB="0" distL="0" distR="0" wp14:anchorId="00D0B776" wp14:editId="42813930">
+            <wp:extent cx="5902325" cy="3153410"/>
+            <wp:effectExtent l="0" t="0" r="3175" b="8890"/>
+            <wp:docPr id="1990390462" name="Picture 1"/>
+            <wp:cNvGraphicFramePr>
+              <a:graphicFrameLocks xmlns:a="http://schemas.openxmlformats.org/drawingml/2006/main" noChangeAspect="1"/>
+            </wp:cNvGraphicFramePr>
+            <a:graphic xmlns:a="http://schemas.openxmlformats.org/drawingml/2006/main">
+              <a:graphicData uri="http://schemas.openxmlformats.org/drawingml/2006/picture">
+                <pic:pic xmlns:pic="http://schemas.openxmlformats.org/drawingml/2006/picture">
+                  <pic:nvPicPr>
+                    <pic:cNvPr id="0" name="Picture 1"/>
+                    <pic:cNvPicPr>
+                      <a:picLocks noChangeAspect="1" noChangeArrowheads="1"/>
+                    </pic:cNvPicPr>
+                  </pic:nvPicPr>
+                  <pic:blipFill>
+                    <a:blip r:embed="rId6" cstate="print">
+                      <a:extLst>
+                        <a:ext uri="{28A0092B-C50C-407E-A947-70E740481C1C}">
+                          <a14:useLocalDpi xmlns:a14="http://schemas.microsoft.com/office/drawing/2010/main" val="0"/>
+                        </a:ext>
+                      </a:extLst>
+                    </a:blip>
+                    <a:srcRect/>
+                    <a:stretch>
+                      <a:fillRect/>
+                    </a:stretch>
+                  </pic:blipFill>
+                  <pic:spPr bwMode="auto">
+                    <a:xfrm>
+                      <a:off x="0" y="0"/>
+                      <a:ext cx="5902325" cy="3153410"/>
+                    </a:xfrm>
+                    <a:prstGeom prst="rect">
+                      <a:avLst/>
+                    </a:prstGeom>
+                    <a:noFill/>
+                    <a:ln>
+                      <a:noFill/>
+                    </a:ln>
+                  </pic:spPr>
+                </pic:pic>
+              </a:graphicData>
+            </a:graphic>
+          </wp:inline>
+        </w:drawing>
+      </w:r>
+    </w:p>
+    <w:p>
+      <w:r>
+        <w:lastRenderedPageBreak/>
+        <w:t xml:space="preserve">In all pages the table showing the data I need to be able to see all dates </w:t>
       </w:r>
     </w:p>
     <w:sectPr>

</xml_diff>